<commit_message>
Enhance Word letterhead with full visual branding
- Embed header and footer banner images matching HTML design colors
- Render company name, logo placeholder, and contacts into banner graphics
- Add cream page background and styled content box for Arabic job description

Co-authored-by: waled najjar <walednajjar2-salam@users.noreply.github.com>
</commit_message>
<xml_diff>
--- a/documents/مدير-إدارة-الضيافة.docx
+++ b/documents/مدير-إدارة-الضيافة.docx
@@ -1,354 +1,413 @@
 
 <file path=word/document.xml><?xml version="1.0" encoding="utf-8"?>
 <w:document xmlns:wpc="http://schemas.microsoft.com/office/word/2010/wordprocessingCanvas" xmlns:mo="http://schemas.microsoft.com/office/mac/office/2008/main" xmlns:mc="http://schemas.openxmlformats.org/markup-compatibility/2006" xmlns:mv="urn:schemas-microsoft-com:mac:vml" xmlns:o="urn:schemas-microsoft-com:office:office" xmlns:r="http://schemas.openxmlformats.org/officeDocument/2006/relationships" xmlns:m="http://schemas.openxmlformats.org/officeDocument/2006/math" xmlns:v="urn:schemas-microsoft-com:vml" xmlns:wp14="http://schemas.microsoft.com/office/word/2010/wordprocessingDrawing" xmlns:wp="http://schemas.openxmlformats.org/drawingml/2006/wordprocessingDrawing" xmlns:w10="urn:schemas-microsoft-com:office:word" xmlns:w="http://schemas.openxmlformats.org/wordprocessingml/2006/main" xmlns:w14="http://schemas.microsoft.com/office/word/2010/wordml" xmlns:wpg="http://schemas.microsoft.com/office/word/2010/wordprocessingGroup" xmlns:wpi="http://schemas.microsoft.com/office/word/2010/wordprocessingInk" xmlns:wne="http://schemas.microsoft.com/office/word/2006/wordml" xmlns:wps="http://schemas.microsoft.com/office/word/2010/wordprocessingShape" mc:Ignorable="w14 wp14">
+  <w:background w:color="F7EEDC"/>
   <w:body>
     <w:p>
       <w:pPr>
-        <w:jc w:val="left"/>
-      </w:pPr>
-      <w:r>
-        <w:rPr>
-          <w:rFonts w:ascii="Arial" w:hAnsi="Arial"/>
-          <w:b/>
-          <w:color w:val="111827"/>
-          <w:sz w:val="48"/>
-        </w:rPr>
-        <w:t>QUALITY OF LAUNCH PROJECTS</w:t>
-        <w:br/>
-        <w:t>LLC</w:t>
-      </w:r>
-    </w:p>
-    <w:p>
-      <w:pPr>
-        <w:spacing w:after="480"/>
-        <w:jc w:val="left"/>
-      </w:pPr>
-      <w:r>
-        <w:rPr>
-          <w:rFonts w:ascii="Arial" w:hAnsi="Arial" w:cs="Arial"/>
-          <w:b/>
-          <w:color w:val="C9A227"/>
-          <w:sz w:val="20"/>
-        </w:rPr>
-        <w:t>REAL ESTATE • PROPERTY MANAGEMENT • HOSPITALITY</w:t>
-      </w:r>
-    </w:p>
-    <w:p>
-      <w:pPr>
-        <w:bidi/>
-        <w:spacing w:after="320"/>
-        <w:jc w:val="right"/>
-      </w:pPr>
-      <w:r>
-        <w:rPr>
-          <w:rFonts w:ascii="Arial" w:hAnsi="Arial" w:cs="Arial"/>
-          <w:b/>
-          <w:color w:val="0D1728"/>
-          <w:sz w:val="36"/>
-        </w:rPr>
-        <w:t>مدير إدارة الضيافة وتنظيم الحفلات</w:t>
-      </w:r>
-    </w:p>
-    <w:p>
-      <w:pPr>
-        <w:pStyle w:val="ListBullet"/>
-        <w:bidi/>
-        <w:spacing w:line="432" w:lineRule="auto" w:after="80"/>
-        <w:jc w:val="right"/>
-      </w:pPr>
-      <w:r>
-        <w:rPr>
-          <w:rFonts w:ascii="Arial" w:hAnsi="Arial" w:cs="Arial"/>
-          <w:color w:val="111827"/>
-          <w:sz w:val="26"/>
-        </w:rPr>
-        <w:t>إدارة الحجوزات والفعاليات</w:t>
-      </w:r>
-    </w:p>
-    <w:p>
-      <w:pPr>
-        <w:pStyle w:val="ListBullet"/>
-        <w:bidi/>
-        <w:spacing w:line="432" w:lineRule="auto" w:after="80"/>
-        <w:jc w:val="right"/>
-      </w:pPr>
-      <w:r>
-        <w:rPr>
-          <w:rFonts w:ascii="Arial" w:hAnsi="Arial" w:cs="Arial"/>
-          <w:color w:val="111827"/>
-          <w:sz w:val="26"/>
-        </w:rPr>
-        <w:t>متابعة تجهيز الحفلات والمناسبات</w:t>
-      </w:r>
-    </w:p>
-    <w:p>
-      <w:pPr>
-        <w:pStyle w:val="ListBullet"/>
-        <w:bidi/>
-        <w:spacing w:line="432" w:lineRule="auto" w:after="80"/>
-        <w:jc w:val="right"/>
-      </w:pPr>
-      <w:r>
-        <w:rPr>
-          <w:rFonts w:ascii="Arial" w:hAnsi="Arial" w:cs="Arial"/>
-          <w:color w:val="111827"/>
-          <w:sz w:val="26"/>
-        </w:rPr>
-        <w:t>الإشراف على فرق التشغيل والعملاء</w:t>
-      </w:r>
-    </w:p>
-    <w:p>
-      <w:pPr>
-        <w:pStyle w:val="ListBullet"/>
-        <w:bidi/>
-        <w:spacing w:line="432" w:lineRule="auto" w:after="80"/>
-        <w:jc w:val="right"/>
-      </w:pPr>
-      <w:r>
-        <w:rPr>
-          <w:rFonts w:ascii="Arial" w:hAnsi="Arial" w:cs="Arial"/>
-          <w:color w:val="111827"/>
-          <w:sz w:val="26"/>
-        </w:rPr>
-        <w:t>إدارة المعدات والعروض الخاصة بالحفلات والفعاليات</w:t>
-      </w:r>
-    </w:p>
-    <w:p>
-      <w:pPr>
-        <w:pStyle w:val="ListBullet"/>
-        <w:bidi/>
-        <w:spacing w:line="432" w:lineRule="auto" w:after="80"/>
-        <w:jc w:val="right"/>
-      </w:pPr>
-      <w:r>
-        <w:rPr>
-          <w:rFonts w:ascii="Arial" w:hAnsi="Arial" w:cs="Arial"/>
-          <w:color w:val="111827"/>
-          <w:sz w:val="26"/>
-        </w:rPr>
-        <w:t>متابعة جودة الخدمة المقدمة بالفعاليات</w:t>
-      </w:r>
-    </w:p>
-    <w:p>
-      <w:pPr>
-        <w:pStyle w:val="ListBullet"/>
-        <w:bidi/>
-        <w:spacing w:line="432" w:lineRule="auto" w:after="80"/>
-        <w:jc w:val="right"/>
-      </w:pPr>
-      <w:r>
-        <w:rPr>
-          <w:rFonts w:ascii="Arial" w:hAnsi="Arial" w:cs="Arial"/>
-          <w:color w:val="111827"/>
-          <w:sz w:val="26"/>
-        </w:rPr>
-        <w:t>استلام وتسليم معدات وتجهيزات الحفلات</w:t>
-      </w:r>
-    </w:p>
-    <w:p>
-      <w:pPr>
-        <w:pStyle w:val="ListBullet"/>
-        <w:bidi/>
-        <w:spacing w:line="432" w:lineRule="auto" w:after="80"/>
-        <w:jc w:val="right"/>
-      </w:pPr>
-      <w:r>
-        <w:rPr>
-          <w:rFonts w:ascii="Arial" w:hAnsi="Arial" w:cs="Arial"/>
-          <w:color w:val="111827"/>
-          <w:sz w:val="26"/>
-        </w:rPr>
-        <w:t>متابعة كميات وأصناف المعدات والتجهيزات</w:t>
-      </w:r>
-    </w:p>
-    <w:p>
-      <w:pPr>
-        <w:pStyle w:val="ListBullet"/>
-        <w:bidi/>
-        <w:spacing w:line="432" w:lineRule="auto" w:after="80"/>
-        <w:jc w:val="right"/>
-      </w:pPr>
-      <w:r>
-        <w:rPr>
-          <w:rFonts w:ascii="Arial" w:hAnsi="Arial" w:cs="Arial"/>
-          <w:color w:val="111827"/>
-          <w:sz w:val="26"/>
-        </w:rPr>
-        <w:t>التأكد من سلامة وصلاحية المعدات</w:t>
-      </w:r>
-    </w:p>
-    <w:p>
-      <w:pPr>
-        <w:pStyle w:val="ListBullet"/>
-        <w:bidi/>
-        <w:spacing w:line="432" w:lineRule="auto" w:after="80"/>
-        <w:jc w:val="right"/>
-      </w:pPr>
-      <w:r>
-        <w:rPr>
-          <w:rFonts w:ascii="Arial" w:hAnsi="Arial" w:cs="Arial"/>
-          <w:color w:val="111827"/>
-          <w:sz w:val="26"/>
-        </w:rPr>
-        <w:t>مطابقة الموجودات والتالف ورفع طلبات الشراء</w:t>
-      </w:r>
-    </w:p>
-    <w:p>
-      <w:pPr>
-        <w:pStyle w:val="ListBullet"/>
-        <w:bidi/>
-        <w:spacing w:line="432" w:lineRule="auto" w:after="80"/>
-        <w:jc w:val="right"/>
-      </w:pPr>
-      <w:r>
-        <w:rPr>
-          <w:rFonts w:ascii="Arial" w:hAnsi="Arial" w:cs="Arial"/>
-          <w:color w:val="111827"/>
-          <w:sz w:val="26"/>
-        </w:rPr>
-        <w:t>المحافظة على جاهزية تنظيم الفعالية مع سجلات المخزون</w:t>
-      </w:r>
-    </w:p>
-    <w:p>
-      <w:pPr>
-        <w:pStyle w:val="ListBullet"/>
-        <w:bidi/>
-        <w:spacing w:line="432" w:lineRule="auto" w:after="80"/>
-        <w:jc w:val="right"/>
-      </w:pPr>
-      <w:r>
-        <w:rPr>
-          <w:rFonts w:ascii="Arial" w:hAnsi="Arial" w:cs="Arial"/>
-          <w:color w:val="111827"/>
-          <w:sz w:val="26"/>
-        </w:rPr>
-        <w:t>متابعة نقل المعدات لأي فعالية</w:t>
-      </w:r>
-    </w:p>
-    <w:p>
-      <w:pPr>
-        <w:pStyle w:val="ListBullet"/>
-        <w:bidi/>
-        <w:spacing w:line="432" w:lineRule="auto" w:after="80"/>
-        <w:jc w:val="right"/>
-      </w:pPr>
-      <w:r>
-        <w:rPr>
-          <w:rFonts w:ascii="Arial" w:hAnsi="Arial" w:cs="Arial"/>
-          <w:color w:val="111827"/>
-          <w:sz w:val="26"/>
-        </w:rPr>
-        <w:t>التنسيق مع قسم النقليات لتوفير وسائل النقل اللازمة للفعاليات والفرق التشغيلية</w:t>
-      </w:r>
-    </w:p>
-    <w:p/>
-    <w:p>
-      <w:pPr>
-        <w:jc w:val="left"/>
-      </w:pPr>
-      <w:r>
-        <w:rPr>
-          <w:rFonts w:ascii="Arial" w:hAnsi="Arial"/>
-          <w:color w:val="111827"/>
-          <w:sz w:val="22"/>
-        </w:rPr>
-        <w:t>Regards,</w:t>
-        <w:br/>
-      </w:r>
-      <w:r>
-        <w:rPr>
-          <w:rFonts w:ascii="Arial" w:hAnsi="Arial"/>
-          <w:b/>
-          <w:color w:val="111827"/>
-          <w:sz w:val="22"/>
-        </w:rPr>
-        <w:t>Signature</w:t>
-        <w:br/>
-      </w:r>
-      <w:r>
-        <w:rPr>
-          <w:rFonts w:ascii="Arial" w:hAnsi="Arial"/>
-          <w:color w:val="111827"/>
-          <w:sz w:val="22"/>
-        </w:rPr>
-        <w:t>QUALITY OF LAUNCH PROJECTS LLC</w:t>
-      </w:r>
-    </w:p>
-    <w:p/>
-    <w:p>
-      <w:pPr>
-        <w:spacing w:before="240"/>
+        <w:spacing w:before="0" w:after="0"/>
         <w:jc w:val="center"/>
       </w:pPr>
       <w:r>
-        <w:rPr>
-          <w:rFonts w:ascii="Arial" w:hAnsi="Arial" w:cs="Arial"/>
-          <w:b w:val="0"/>
-          <w:color w:val="05AAA1"/>
-          <w:sz w:val="16"/>
-        </w:rPr>
-        <w:t>————————————————————————————————————————</w:t>
+        <w:drawing>
+          <wp:inline xmlns:a="http://schemas.openxmlformats.org/drawingml/2006/main" xmlns:pic="http://schemas.openxmlformats.org/drawingml/2006/picture">
+            <wp:extent cx="7560000" cy="1341290"/>
+            <wp:docPr id="1" name="Picture 1"/>
+            <wp:cNvGraphicFramePr>
+              <a:graphicFrameLocks noChangeAspect="1"/>
+            </wp:cNvGraphicFramePr>
+            <a:graphic>
+              <a:graphicData uri="http://schemas.openxmlformats.org/drawingml/2006/picture">
+                <pic:pic>
+                  <pic:nvPicPr>
+                    <pic:cNvPr id="0" name="letterhead-header.png"/>
+                    <pic:cNvPicPr/>
+                  </pic:nvPicPr>
+                  <pic:blipFill>
+                    <a:blip r:embed="rId9"/>
+                    <a:stretch>
+                      <a:fillRect/>
+                    </a:stretch>
+                  </pic:blipFill>
+                  <pic:spPr>
+                    <a:xfrm>
+                      <a:off x="0" y="0"/>
+                      <a:ext cx="7560000" cy="1341290"/>
+                    </a:xfrm>
+                    <a:prstGeom prst="rect"/>
+                  </pic:spPr>
+                </pic:pic>
+              </a:graphicData>
+            </a:graphic>
+          </wp:inline>
+        </w:drawing>
       </w:r>
     </w:p>
+    <w:tbl>
+      <w:tblPr>
+        <w:tblW w:type="auto" w:w="0"/>
+        <w:jc w:val="center"/>
+        <w:tblLook w:firstColumn="1" w:firstRow="1" w:lastColumn="0" w:lastRow="0" w:noHBand="0" w:noVBand="1" w:val="04A0"/>
+        <w:tblBorders>
+          <w:top w:val="nil"/>
+          <w:left w:val="nil"/>
+          <w:bottom w:val="nil"/>
+          <w:right w:val="nil"/>
+          <w:insideH w:val="nil"/>
+          <w:insideV w:val="nil"/>
+        </w:tblBorders>
+      </w:tblPr>
+      <w:tblGrid>
+        <w:gridCol w:w="9026"/>
+      </w:tblGrid>
+      <w:tr>
+        <w:tc>
+          <w:tcPr>
+            <w:tcW w:type="dxa" w:w="9026"/>
+            <w:shd w:fill="FFFFFF" w:val="clear"/>
+            <w:tcMar>
+              <w:top w:w="180" w:type="dxa"/>
+              <w:start w:w="360" w:type="dxa"/>
+              <w:bottom w:w="180" w:type="dxa"/>
+              <w:end w:w="360" w:type="dxa"/>
+            </w:tcMar>
+            <w:tcBorders>
+              <w:top w:val="single" w:sz="4" w:color="E8DFC8"/>
+              <w:left w:val="single" w:sz="4" w:color="E8DFC8"/>
+              <w:bottom w:val="single" w:sz="4" w:color="E8DFC8"/>
+              <w:right w:val="single" w:sz="4" w:color="E8DFC8"/>
+            </w:tcBorders>
+          </w:tcPr>
+          <w:p>
+            <w:pPr>
+              <w:bidi/>
+              <w:spacing w:after="280"/>
+              <w:jc w:val="right"/>
+            </w:pPr>
+            <w:r>
+              <w:rPr>
+                <w:rFonts w:ascii="Arial" w:hAnsi="Arial" w:cs="Arial"/>
+                <w:b/>
+                <w:color w:val="0D1728"/>
+                <w:sz w:val="32"/>
+              </w:rPr>
+              <w:t>مدير إدارة الضيافة وتنظيم الحفلات</w:t>
+            </w:r>
+          </w:p>
+          <w:p>
+            <w:pPr>
+              <w:pStyle w:val="ListBullet"/>
+              <w:bidi/>
+              <w:spacing w:line="456" w:lineRule="auto" w:after="60"/>
+              <w:jc w:val="right"/>
+            </w:pPr>
+            <w:r>
+              <w:rPr>
+                <w:rFonts w:ascii="Arial" w:hAnsi="Arial" w:cs="Arial"/>
+                <w:b w:val="0"/>
+                <w:color w:val="111827"/>
+                <w:sz w:val="24"/>
+              </w:rPr>
+              <w:t>إدارة الحجوزات والفعاليات</w:t>
+            </w:r>
+          </w:p>
+          <w:p>
+            <w:pPr>
+              <w:pStyle w:val="ListBullet"/>
+              <w:bidi/>
+              <w:spacing w:line="456" w:lineRule="auto" w:after="60"/>
+              <w:jc w:val="right"/>
+            </w:pPr>
+            <w:r>
+              <w:rPr>
+                <w:rFonts w:ascii="Arial" w:hAnsi="Arial" w:cs="Arial"/>
+                <w:b w:val="0"/>
+                <w:color w:val="111827"/>
+                <w:sz w:val="24"/>
+              </w:rPr>
+              <w:t>متابعة تجهيز الحفلات والمناسبات</w:t>
+            </w:r>
+          </w:p>
+          <w:p>
+            <w:pPr>
+              <w:pStyle w:val="ListBullet"/>
+              <w:bidi/>
+              <w:spacing w:line="456" w:lineRule="auto" w:after="60"/>
+              <w:jc w:val="right"/>
+            </w:pPr>
+            <w:r>
+              <w:rPr>
+                <w:rFonts w:ascii="Arial" w:hAnsi="Arial" w:cs="Arial"/>
+                <w:b w:val="0"/>
+                <w:color w:val="111827"/>
+                <w:sz w:val="24"/>
+              </w:rPr>
+              <w:t>الإشراف على فرق التشغيل والعملاء</w:t>
+            </w:r>
+          </w:p>
+          <w:p>
+            <w:pPr>
+              <w:pStyle w:val="ListBullet"/>
+              <w:bidi/>
+              <w:spacing w:line="456" w:lineRule="auto" w:after="60"/>
+              <w:jc w:val="right"/>
+            </w:pPr>
+            <w:r>
+              <w:rPr>
+                <w:rFonts w:ascii="Arial" w:hAnsi="Arial" w:cs="Arial"/>
+                <w:b w:val="0"/>
+                <w:color w:val="111827"/>
+                <w:sz w:val="24"/>
+              </w:rPr>
+              <w:t>إدارة المعدات والعروض الخاصة بالحفلات والفعاليات</w:t>
+            </w:r>
+          </w:p>
+          <w:p>
+            <w:pPr>
+              <w:pStyle w:val="ListBullet"/>
+              <w:bidi/>
+              <w:spacing w:line="456" w:lineRule="auto" w:after="60"/>
+              <w:jc w:val="right"/>
+            </w:pPr>
+            <w:r>
+              <w:rPr>
+                <w:rFonts w:ascii="Arial" w:hAnsi="Arial" w:cs="Arial"/>
+                <w:b w:val="0"/>
+                <w:color w:val="111827"/>
+                <w:sz w:val="24"/>
+              </w:rPr>
+              <w:t>متابعة جودة الخدمة المقدمة بالفعاليات</w:t>
+            </w:r>
+          </w:p>
+          <w:p>
+            <w:pPr>
+              <w:pStyle w:val="ListBullet"/>
+              <w:bidi/>
+              <w:spacing w:line="456" w:lineRule="auto" w:after="60"/>
+              <w:jc w:val="right"/>
+            </w:pPr>
+            <w:r>
+              <w:rPr>
+                <w:rFonts w:ascii="Arial" w:hAnsi="Arial" w:cs="Arial"/>
+                <w:b w:val="0"/>
+                <w:color w:val="111827"/>
+                <w:sz w:val="24"/>
+              </w:rPr>
+              <w:t>استلام وتسليم معدات وتجهيزات الحفلات</w:t>
+            </w:r>
+          </w:p>
+          <w:p>
+            <w:pPr>
+              <w:pStyle w:val="ListBullet"/>
+              <w:bidi/>
+              <w:spacing w:line="456" w:lineRule="auto" w:after="60"/>
+              <w:jc w:val="right"/>
+            </w:pPr>
+            <w:r>
+              <w:rPr>
+                <w:rFonts w:ascii="Arial" w:hAnsi="Arial" w:cs="Arial"/>
+                <w:b w:val="0"/>
+                <w:color w:val="111827"/>
+                <w:sz w:val="24"/>
+              </w:rPr>
+              <w:t>متابعة كميات وأصناف المعدات والتجهيزات</w:t>
+            </w:r>
+          </w:p>
+          <w:p>
+            <w:pPr>
+              <w:pStyle w:val="ListBullet"/>
+              <w:bidi/>
+              <w:spacing w:line="456" w:lineRule="auto" w:after="60"/>
+              <w:jc w:val="right"/>
+            </w:pPr>
+            <w:r>
+              <w:rPr>
+                <w:rFonts w:ascii="Arial" w:hAnsi="Arial" w:cs="Arial"/>
+                <w:b w:val="0"/>
+                <w:color w:val="111827"/>
+                <w:sz w:val="24"/>
+              </w:rPr>
+              <w:t>التأكد من سلامة وصلاحية المعدات</w:t>
+            </w:r>
+          </w:p>
+          <w:p>
+            <w:pPr>
+              <w:pStyle w:val="ListBullet"/>
+              <w:bidi/>
+              <w:spacing w:line="456" w:lineRule="auto" w:after="60"/>
+              <w:jc w:val="right"/>
+            </w:pPr>
+            <w:r>
+              <w:rPr>
+                <w:rFonts w:ascii="Arial" w:hAnsi="Arial" w:cs="Arial"/>
+                <w:b w:val="0"/>
+                <w:color w:val="111827"/>
+                <w:sz w:val="24"/>
+              </w:rPr>
+              <w:t>مطابقة الموجودات والتالف ورفع طلبات الشراء</w:t>
+            </w:r>
+          </w:p>
+          <w:p>
+            <w:pPr>
+              <w:pStyle w:val="ListBullet"/>
+              <w:bidi/>
+              <w:spacing w:line="456" w:lineRule="auto" w:after="60"/>
+              <w:jc w:val="right"/>
+            </w:pPr>
+            <w:r>
+              <w:rPr>
+                <w:rFonts w:ascii="Arial" w:hAnsi="Arial" w:cs="Arial"/>
+                <w:b w:val="0"/>
+                <w:color w:val="111827"/>
+                <w:sz w:val="24"/>
+              </w:rPr>
+              <w:t>المحافظة على جاهزية تنظيم الفعالية مع سجلات المخزون</w:t>
+            </w:r>
+          </w:p>
+          <w:p>
+            <w:pPr>
+              <w:pStyle w:val="ListBullet"/>
+              <w:bidi/>
+              <w:spacing w:line="456" w:lineRule="auto" w:after="60"/>
+              <w:jc w:val="right"/>
+            </w:pPr>
+            <w:r>
+              <w:rPr>
+                <w:rFonts w:ascii="Arial" w:hAnsi="Arial" w:cs="Arial"/>
+                <w:b w:val="0"/>
+                <w:color w:val="111827"/>
+                <w:sz w:val="24"/>
+              </w:rPr>
+              <w:t>متابعة نقل المعدات لأي فعالية</w:t>
+            </w:r>
+          </w:p>
+          <w:p>
+            <w:pPr>
+              <w:pStyle w:val="ListBullet"/>
+              <w:bidi/>
+              <w:spacing w:line="456" w:lineRule="auto" w:after="60"/>
+              <w:jc w:val="right"/>
+            </w:pPr>
+            <w:r>
+              <w:rPr>
+                <w:rFonts w:ascii="Arial" w:hAnsi="Arial" w:cs="Arial"/>
+                <w:b w:val="0"/>
+                <w:color w:val="111827"/>
+                <w:sz w:val="24"/>
+              </w:rPr>
+              <w:t>التنسيق مع قسم النقليات لتوفير وسائل النقل اللازمة للفعاليات والفرق التشغيلية</w:t>
+            </w:r>
+          </w:p>
+        </w:tc>
+      </w:tr>
+    </w:tbl>
+    <w:tbl>
+      <w:tblPr>
+        <w:tblW w:type="auto" w:w="0"/>
+        <w:tblLook w:firstColumn="1" w:firstRow="1" w:lastColumn="0" w:lastRow="0" w:noHBand="0" w:noVBand="1" w:val="04A0"/>
+        <w:tblBorders>
+          <w:top w:val="nil"/>
+          <w:left w:val="nil"/>
+          <w:bottom w:val="nil"/>
+          <w:right w:val="nil"/>
+          <w:insideH w:val="nil"/>
+          <w:insideV w:val="nil"/>
+        </w:tblBorders>
+      </w:tblPr>
+      <w:tblGrid>
+        <w:gridCol w:w="9026"/>
+      </w:tblGrid>
+      <w:tr>
+        <w:tc>
+          <w:tcPr>
+            <w:tcW w:type="dxa" w:w="9026"/>
+            <w:tcMar>
+              <w:top w:w="120" w:type="dxa"/>
+              <w:start w:w="360" w:type="dxa"/>
+              <w:bottom w:w="60" w:type="dxa"/>
+              <w:end w:w="360" w:type="dxa"/>
+            </w:tcMar>
+          </w:tcPr>
+          <w:p>
+            <w:pPr>
+              <w:jc w:val="left"/>
+            </w:pPr>
+            <w:r>
+              <w:rPr>
+                <w:rFonts w:ascii="Arial" w:hAnsi="Arial" w:cs="Arial"/>
+                <w:b w:val="0"/>
+                <w:color w:val="111827"/>
+                <w:sz w:val="20"/>
+              </w:rPr>
+              <w:t>Regards,</w:t>
+              <w:br/>
+            </w:r>
+            <w:r>
+              <w:rPr>
+                <w:rFonts w:ascii="Arial" w:hAnsi="Arial" w:cs="Arial"/>
+                <w:b/>
+                <w:color w:val="111827"/>
+                <w:sz w:val="20"/>
+              </w:rPr>
+              <w:t>Signature</w:t>
+              <w:br/>
+            </w:r>
+            <w:r>
+              <w:rPr>
+                <w:rFonts w:ascii="Arial" w:hAnsi="Arial" w:cs="Arial"/>
+                <w:b w:val="0"/>
+                <w:color w:val="111827"/>
+                <w:sz w:val="20"/>
+              </w:rPr>
+              <w:t>QUALITY OF LAUNCH PROJECTS LLC</w:t>
+            </w:r>
+          </w:p>
+        </w:tc>
+      </w:tr>
+    </w:tbl>
     <w:p>
       <w:pPr>
-        <w:spacing w:after="40"/>
-        <w:jc w:val="right"/>
+        <w:spacing w:before="0" w:after="0"/>
+        <w:jc w:val="center"/>
       </w:pPr>
       <w:r>
-        <w:rPr>
-          <w:rFonts w:ascii="Arial" w:hAnsi="Arial"/>
-          <w:color w:val="05AAA1"/>
-          <w:sz w:val="20"/>
-        </w:rPr>
-        <w:t>info@qualitylaunch.om  ✉</w:t>
-      </w:r>
-    </w:p>
-    <w:p>
-      <w:pPr>
-        <w:spacing w:after="40"/>
-        <w:jc w:val="right"/>
-      </w:pPr>
-      <w:r>
-        <w:rPr>
-          <w:rFonts w:ascii="Arial" w:hAnsi="Arial"/>
-          <w:color w:val="05AAA1"/>
-          <w:sz w:val="20"/>
-        </w:rPr>
-        <w:t>+968 92120205  ☎</w:t>
-      </w:r>
-    </w:p>
-    <w:p>
-      <w:pPr>
-        <w:spacing w:after="40"/>
-        <w:jc w:val="right"/>
-      </w:pPr>
-      <w:r>
-        <w:rPr>
-          <w:rFonts w:ascii="Arial" w:hAnsi="Arial"/>
-          <w:color w:val="05AAA1"/>
-          <w:sz w:val="20"/>
-        </w:rPr>
-        <w:t>www.qualitylaunch.om  🌐</w:t>
-      </w:r>
-    </w:p>
-    <w:p>
-      <w:pPr>
-        <w:spacing w:after="40"/>
-        <w:jc w:val="right"/>
-      </w:pPr>
-      <w:r>
-        <w:rPr>
-          <w:rFonts w:ascii="Arial" w:hAnsi="Arial"/>
-          <w:color w:val="05AAA1"/>
-          <w:sz w:val="20"/>
-        </w:rPr>
-        <w:t>Nizwa, Sultanate of Oman  ⌖</w:t>
+        <w:drawing>
+          <wp:inline xmlns:a="http://schemas.openxmlformats.org/drawingml/2006/main" xmlns:pic="http://schemas.openxmlformats.org/drawingml/2006/picture">
+            <wp:extent cx="7560000" cy="1707097"/>
+            <wp:docPr id="2" name="Picture 2"/>
+            <wp:cNvGraphicFramePr>
+              <a:graphicFrameLocks noChangeAspect="1"/>
+            </wp:cNvGraphicFramePr>
+            <a:graphic>
+              <a:graphicData uri="http://schemas.openxmlformats.org/drawingml/2006/picture">
+                <pic:pic>
+                  <pic:nvPicPr>
+                    <pic:cNvPr id="0" name="letterhead-footer.png"/>
+                    <pic:cNvPicPr/>
+                  </pic:nvPicPr>
+                  <pic:blipFill>
+                    <a:blip r:embed="rId10"/>
+                    <a:stretch>
+                      <a:fillRect/>
+                    </a:stretch>
+                  </pic:blipFill>
+                  <pic:spPr>
+                    <a:xfrm>
+                      <a:off x="0" y="0"/>
+                      <a:ext cx="7560000" cy="1707097"/>
+                    </a:xfrm>
+                    <a:prstGeom prst="rect"/>
+                  </pic:spPr>
+                </pic:pic>
+              </a:graphicData>
+            </a:graphic>
+          </wp:inline>
+        </w:drawing>
       </w:r>
     </w:p>
     <w:sectPr>
       <w:pgSz w:w="11906" w:h="16838"/>
-      <w:pgMar w:top="850" w:right="1134" w:bottom="850" w:left="1134" w:header="720" w:footer="720" w:gutter="0"/>
+      <w:pgMar w:top="0" w:right="0" w:bottom="0" w:left="0" w:header="720" w:footer="720" w:gutter="0"/>
       <w:cols w:space="720"/>
       <w:docGrid w:linePitch="360"/>
     </w:sectPr>

</xml_diff>